<commit_message>
Added: Assignment for the course
</commit_message>
<xml_diff>
--- a/FactoryMethodPattern/Design Patterns - 004 - Abstract Factory Method Pattern.docx
+++ b/FactoryMethodPattern/Design Patterns - 004 - Abstract Factory Method Pattern.docx
@@ -11,15 +11,7 @@
         </w:rPr>
       </w:pPr>
       <w:r>
-        <w:t xml:space="preserve">Design </w:t>
-      </w:r>
-      <w:proofErr w:type="spellStart"/>
-      <w:r>
-        <w:t>Patterns</w:t>
-      </w:r>
-      <w:proofErr w:type="spellEnd"/>
-      <w:r>
-        <w:t xml:space="preserve"> –</w:t>
+        <w:t>Design Patterns –</w:t>
       </w:r>
       <w:r>
         <w:t xml:space="preserve"> </w:t>
@@ -34,24 +26,11 @@
         <w:t>)</w:t>
       </w:r>
       <w:r>
-        <w:t xml:space="preserve"> </w:t>
-      </w:r>
-      <w:proofErr w:type="spellStart"/>
-      <w:r>
-        <w:t>Factory</w:t>
-      </w:r>
-      <w:proofErr w:type="spellEnd"/>
-      <w:r>
-        <w:t xml:space="preserve"> Method</w:t>
+        <w:t xml:space="preserve"> Factory Method</w:t>
       </w:r>
       <w:r>
-        <w:t xml:space="preserve"> </w:t>
+        <w:t xml:space="preserve"> Pattern</w:t>
       </w:r>
-      <w:proofErr w:type="spellStart"/>
-      <w:r>
-        <w:t>Pattern</w:t>
-      </w:r>
-      <w:proofErr w:type="spellEnd"/>
     </w:p>
     <w:tbl>
       <w:tblPr>
@@ -356,15 +335,7 @@
               <w:pStyle w:val="Plattetekst"/>
             </w:pPr>
             <w:r>
-              <w:t xml:space="preserve">De codebase en dit document zijn voortaan te vinden in een GIT </w:t>
-            </w:r>
-            <w:proofErr w:type="spellStart"/>
-            <w:r>
-              <w:t>repository</w:t>
-            </w:r>
-            <w:proofErr w:type="spellEnd"/>
-            <w:r>
-              <w:t>. Link is toegevoegd</w:t>
+              <w:t>De codebase en dit document zijn voortaan te vinden in een GIT repository. Link is toegevoegd</w:t>
             </w:r>
           </w:p>
           <w:p>
@@ -415,9 +386,9 @@
             </w:tabs>
             <w:rPr>
               <w:noProof/>
-              <w:sz w:val="22"/>
-              <w:szCs w:val="22"/>
+              <w:kern w:val="2"/>
               <w:lang w:eastAsia="nl-NL"/>
+              <w14:ligatures w14:val="standardContextual"/>
             </w:rPr>
           </w:pPr>
           <w:r>
@@ -429,7 +400,7 @@
           <w:r>
             <w:fldChar w:fldCharType="separate"/>
           </w:r>
-          <w:hyperlink w:anchor="_Toc146706771" w:history="1">
+          <w:hyperlink w:anchor="_Toc242431907" w:history="1">
             <w:r>
               <w:rPr>
                 <w:rStyle w:val="Hyperlink"/>
@@ -456,7 +427,7 @@
                 <w:noProof/>
                 <w:webHidden/>
               </w:rPr>
-              <w:instrText xml:space="preserve"> PAGEREF _Toc146706771 \h </w:instrText>
+              <w:instrText xml:space="preserve"> PAGEREF _Toc242431907 \h </w:instrText>
             </w:r>
             <w:r>
               <w:rPr>
@@ -476,7 +447,78 @@
                 <w:noProof/>
                 <w:webHidden/>
               </w:rPr>
-              <w:t>3</w:t>
+              <w:t>2</w:t>
+            </w:r>
+            <w:r>
+              <w:rPr>
+                <w:noProof/>
+                <w:webHidden/>
+              </w:rPr>
+              <w:fldChar w:fldCharType="end"/>
+            </w:r>
+          </w:hyperlink>
+        </w:p>
+        <w:p>
+          <w:pPr>
+            <w:pStyle w:val="Inhopg1"/>
+            <w:tabs>
+              <w:tab w:val="right" w:leader="dot" w:pos="9628"/>
+            </w:tabs>
+            <w:rPr>
+              <w:noProof/>
+              <w:kern w:val="2"/>
+              <w:lang w:eastAsia="nl-NL"/>
+              <w14:ligatures w14:val="standardContextual"/>
+            </w:rPr>
+          </w:pPr>
+          <w:hyperlink w:anchor="_Toc242431908" w:history="1">
+            <w:r>
+              <w:rPr>
+                <w:rStyle w:val="Hyperlink"/>
+                <w:noProof/>
+              </w:rPr>
+              <w:t>Opdracht #2 – Realiseer</w:t>
+            </w:r>
+            <w:r>
+              <w:rPr>
+                <w:noProof/>
+                <w:webHidden/>
+              </w:rPr>
+              <w:tab/>
+            </w:r>
+            <w:r>
+              <w:rPr>
+                <w:noProof/>
+                <w:webHidden/>
+              </w:rPr>
+              <w:fldChar w:fldCharType="begin"/>
+            </w:r>
+            <w:r>
+              <w:rPr>
+                <w:noProof/>
+                <w:webHidden/>
+              </w:rPr>
+              <w:instrText xml:space="preserve"> PAGEREF _Toc242431908 \h </w:instrText>
+            </w:r>
+            <w:r>
+              <w:rPr>
+                <w:noProof/>
+                <w:webHidden/>
+              </w:rPr>
+            </w:r>
+            <w:r>
+              <w:rPr>
+                <w:noProof/>
+                <w:webHidden/>
+              </w:rPr>
+              <w:fldChar w:fldCharType="separate"/>
+            </w:r>
+            <w:r>
+              <w:rPr>
+                <w:noProof/>
+                <w:webHidden/>
+              </w:rPr>
+              <w:t>2</w:t>
             </w:r>
             <w:r>
               <w:rPr>
@@ -501,7 +543,7 @@
       <w:r>
         <w:br w:type="page"/>
       </w:r>
-      <w:bookmarkStart w:id="0" w:name="_Toc146706771"/>
+      <w:bookmarkStart w:id="0" w:name="_Toc242431907"/>
       <w:r>
         <w:lastRenderedPageBreak/>
         <w:t>Opdracht #1</w:t>
@@ -515,45 +557,8 @@
       <w:pPr>
         <w:pStyle w:val="Geenafstand"/>
       </w:pPr>
-      <w:proofErr w:type="spellStart"/>
       <w:r>
-        <w:t>Merge</w:t>
-      </w:r>
-      <w:proofErr w:type="spellEnd"/>
-      <w:r>
-        <w:t xml:space="preserve"> jouw </w:t>
-      </w:r>
-      <w:proofErr w:type="spellStart"/>
-      <w:r>
-        <w:t>Decorator</w:t>
-      </w:r>
-      <w:proofErr w:type="spellEnd"/>
-      <w:r>
-        <w:t xml:space="preserve"> </w:t>
-      </w:r>
-      <w:proofErr w:type="spellStart"/>
-      <w:r>
-        <w:t>Branch</w:t>
-      </w:r>
-      <w:proofErr w:type="spellEnd"/>
-      <w:r>
-        <w:t xml:space="preserve"> met deze (</w:t>
-      </w:r>
-      <w:proofErr w:type="spellStart"/>
-      <w:r>
-        <w:t>FactoryMethodPattern</w:t>
-      </w:r>
-      <w:proofErr w:type="spellEnd"/>
-      <w:r>
-        <w:t xml:space="preserve">) </w:t>
-      </w:r>
-      <w:proofErr w:type="spellStart"/>
-      <w:r>
-        <w:t>branch</w:t>
-      </w:r>
-      <w:proofErr w:type="spellEnd"/>
-      <w:r>
-        <w:t>.</w:t>
+        <w:t>Merge jouw Decorator Branch met deze (FactoryMethodPattern) branch.</w:t>
       </w:r>
     </w:p>
     <w:p>
@@ -565,58 +570,20 @@
       <w:pPr>
         <w:pStyle w:val="Kop1"/>
       </w:pPr>
+      <w:bookmarkStart w:id="1" w:name="_Toc242431908"/>
       <w:r>
         <w:t>Opdracht #2 – Realiseer</w:t>
+      </w:r>
+      <w:bookmarkEnd w:id="1"/>
+    </w:p>
+    <w:p>
+      <w:r>
+        <w:t xml:space="preserve">Maak gebruik van een (Abstract) Factory method pattern om ervoor te garanderen dat men alleen de volgende dranken kan bestellen. </w:t>
       </w:r>
     </w:p>
     <w:p>
       <w:r>
-        <w:t xml:space="preserve">Maak gebruik van een (Abstract) </w:t>
-      </w:r>
-      <w:proofErr w:type="spellStart"/>
-      <w:r>
-        <w:t>Factory</w:t>
-      </w:r>
-      <w:proofErr w:type="spellEnd"/>
-      <w:r>
-        <w:t xml:space="preserve"> </w:t>
-      </w:r>
-      <w:proofErr w:type="spellStart"/>
-      <w:r>
-        <w:t>method</w:t>
-      </w:r>
-      <w:proofErr w:type="spellEnd"/>
-      <w:r>
-        <w:t xml:space="preserve"> </w:t>
-      </w:r>
-      <w:proofErr w:type="spellStart"/>
-      <w:r>
-        <w:t>pattern</w:t>
-      </w:r>
-      <w:proofErr w:type="spellEnd"/>
-      <w:r>
-        <w:t xml:space="preserve"> om ervoor te garanderen dat men alleen de volgende dranken kan bestellen. </w:t>
-      </w:r>
-    </w:p>
-    <w:p>
-      <w:r>
-        <w:t xml:space="preserve">Tip: Het argument voor de </w:t>
-      </w:r>
-      <w:proofErr w:type="spellStart"/>
-      <w:r>
-        <w:t>Factory</w:t>
-      </w:r>
-      <w:proofErr w:type="spellEnd"/>
-      <w:r>
-        <w:t xml:space="preserve"> Method kun je het beste een </w:t>
-      </w:r>
-      <w:proofErr w:type="spellStart"/>
-      <w:r>
-        <w:t>Enumeration</w:t>
-      </w:r>
-      <w:proofErr w:type="spellEnd"/>
-      <w:r>
-        <w:t xml:space="preserve"> maken.</w:t>
+        <w:t>Tip: Het argument voor de Factory Method kun je het beste een Enumeration maken.</w:t>
       </w:r>
     </w:p>
     <w:tbl>
@@ -644,13 +611,8 @@
           </w:tcPr>
           <w:p>
             <w:r>
-              <w:t xml:space="preserve">Coffee </w:t>
-            </w:r>
-            <w:proofErr w:type="spellStart"/>
-            <w:r>
-              <w:t>mixes</w:t>
-            </w:r>
-            <w:proofErr w:type="spellEnd"/>
+              <w:t>Coffee mixes</w:t>
+            </w:r>
           </w:p>
         </w:tc>
         <w:tc>
@@ -679,11 +641,9 @@
             <w:pPr>
               <w:cnfStyle w:val="100000000000" w:firstRow="1" w:lastRow="0" w:firstColumn="0" w:lastColumn="0" w:oddVBand="0" w:evenVBand="0" w:oddHBand="0" w:evenHBand="0" w:firstRowFirstColumn="0" w:firstRowLastColumn="0" w:lastRowFirstColumn="0" w:lastRowLastColumn="0"/>
             </w:pPr>
-            <w:proofErr w:type="spellStart"/>
             <w:r>
               <w:t>Condiments</w:t>
             </w:r>
-            <w:proofErr w:type="spellEnd"/>
           </w:p>
         </w:tc>
       </w:tr>
@@ -763,11 +723,9 @@
             <w:tcW w:w="0" w:type="auto"/>
           </w:tcPr>
           <w:p>
-            <w:proofErr w:type="spellStart"/>
             <w:r>
               <w:t>Doppio</w:t>
             </w:r>
-            <w:proofErr w:type="spellEnd"/>
           </w:p>
         </w:tc>
         <w:tc>
@@ -837,11 +795,9 @@
             <w:tcW w:w="0" w:type="auto"/>
           </w:tcPr>
           <w:p>
-            <w:proofErr w:type="spellStart"/>
             <w:r>
               <w:t>Lungo</w:t>
             </w:r>
-            <w:proofErr w:type="spellEnd"/>
           </w:p>
         </w:tc>
         <w:tc>
@@ -908,11 +864,9 @@
             <w:tcW w:w="0" w:type="auto"/>
           </w:tcPr>
           <w:p>
-            <w:proofErr w:type="spellStart"/>
             <w:r>
               <w:t>Macchiato</w:t>
             </w:r>
-            <w:proofErr w:type="spellEnd"/>
           </w:p>
         </w:tc>
         <w:tc>
@@ -936,19 +890,9 @@
             <w:pPr>
               <w:cnfStyle w:val="000000000000" w:firstRow="0" w:lastRow="0" w:firstColumn="0" w:lastColumn="0" w:oddVBand="0" w:evenVBand="0" w:oddHBand="0" w:evenHBand="0" w:firstRowFirstColumn="0" w:firstRowLastColumn="0" w:lastRowFirstColumn="0" w:lastRowLastColumn="0"/>
             </w:pPr>
-            <w:proofErr w:type="spellStart"/>
-            <w:r>
-              <w:t>Milk</w:t>
-            </w:r>
-            <w:proofErr w:type="spellEnd"/>
-            <w:r>
-              <w:t xml:space="preserve"> </w:t>
-            </w:r>
-            <w:proofErr w:type="spellStart"/>
-            <w:r>
-              <w:t>Foam</w:t>
-            </w:r>
-            <w:proofErr w:type="spellEnd"/>
+            <w:r>
+              <w:t>Milk Foam</w:t>
+            </w:r>
           </w:p>
         </w:tc>
         <w:tc>
@@ -992,11 +936,9 @@
             <w:tcW w:w="0" w:type="auto"/>
           </w:tcPr>
           <w:p>
-            <w:proofErr w:type="spellStart"/>
             <w:r>
               <w:t>Corretta</w:t>
             </w:r>
-            <w:proofErr w:type="spellEnd"/>
           </w:p>
         </w:tc>
         <w:tc>
@@ -1020,11 +962,9 @@
             <w:pPr>
               <w:cnfStyle w:val="000000100000" w:firstRow="0" w:lastRow="0" w:firstColumn="0" w:lastColumn="0" w:oddVBand="0" w:evenVBand="0" w:oddHBand="1" w:evenHBand="0" w:firstRowFirstColumn="0" w:firstRowLastColumn="0" w:lastRowFirstColumn="0" w:lastRowLastColumn="0"/>
             </w:pPr>
-            <w:proofErr w:type="spellStart"/>
             <w:r>
               <w:t>Liqour</w:t>
             </w:r>
-            <w:proofErr w:type="spellEnd"/>
           </w:p>
         </w:tc>
         <w:tc>
@@ -1066,13 +1006,8 @@
           </w:tcPr>
           <w:p>
             <w:r>
-              <w:t xml:space="preserve">Con </w:t>
-            </w:r>
-            <w:proofErr w:type="spellStart"/>
-            <w:r>
-              <w:t>Panna</w:t>
-            </w:r>
-            <w:proofErr w:type="spellEnd"/>
+              <w:t>Con Panna</w:t>
+            </w:r>
           </w:p>
         </w:tc>
         <w:tc>
@@ -1096,11 +1031,9 @@
             <w:pPr>
               <w:cnfStyle w:val="000000000000" w:firstRow="0" w:lastRow="0" w:firstColumn="0" w:lastColumn="0" w:oddVBand="0" w:evenVBand="0" w:oddHBand="0" w:evenHBand="0" w:firstRowFirstColumn="0" w:firstRowLastColumn="0" w:lastRowFirstColumn="0" w:lastRowLastColumn="0"/>
             </w:pPr>
-            <w:proofErr w:type="spellStart"/>
             <w:r>
               <w:t>Whip</w:t>
             </w:r>
-            <w:proofErr w:type="spellEnd"/>
           </w:p>
         </w:tc>
         <w:tc>
@@ -1144,11 +1077,9 @@
             <w:tcW w:w="0" w:type="auto"/>
           </w:tcPr>
           <w:p>
-            <w:proofErr w:type="spellStart"/>
             <w:r>
               <w:t>Cappucinno</w:t>
             </w:r>
-            <w:proofErr w:type="spellEnd"/>
           </w:p>
         </w:tc>
         <w:tc>
@@ -1172,19 +1103,9 @@
             <w:pPr>
               <w:cnfStyle w:val="000000100000" w:firstRow="0" w:lastRow="0" w:firstColumn="0" w:lastColumn="0" w:oddVBand="0" w:evenVBand="0" w:oddHBand="1" w:evenHBand="0" w:firstRowFirstColumn="0" w:firstRowLastColumn="0" w:lastRowFirstColumn="0" w:lastRowLastColumn="0"/>
             </w:pPr>
-            <w:proofErr w:type="spellStart"/>
-            <w:r>
-              <w:t>Steamed</w:t>
-            </w:r>
-            <w:proofErr w:type="spellEnd"/>
-            <w:r>
-              <w:t xml:space="preserve"> </w:t>
-            </w:r>
-            <w:proofErr w:type="spellStart"/>
-            <w:r>
-              <w:t>Milk</w:t>
-            </w:r>
-            <w:proofErr w:type="spellEnd"/>
+            <w:r>
+              <w:t>Steamed Milk</w:t>
+            </w:r>
           </w:p>
         </w:tc>
         <w:tc>
@@ -1195,19 +1116,9 @@
             <w:pPr>
               <w:cnfStyle w:val="000000100000" w:firstRow="0" w:lastRow="0" w:firstColumn="0" w:lastColumn="0" w:oddVBand="0" w:evenVBand="0" w:oddHBand="1" w:evenHBand="0" w:firstRowFirstColumn="0" w:firstRowLastColumn="0" w:lastRowFirstColumn="0" w:lastRowLastColumn="0"/>
             </w:pPr>
-            <w:proofErr w:type="spellStart"/>
-            <w:r>
-              <w:t>Milk</w:t>
-            </w:r>
-            <w:proofErr w:type="spellEnd"/>
-            <w:r>
-              <w:t xml:space="preserve"> </w:t>
-            </w:r>
-            <w:proofErr w:type="spellStart"/>
-            <w:r>
-              <w:t>Foam</w:t>
-            </w:r>
-            <w:proofErr w:type="spellEnd"/>
+            <w:r>
+              <w:t>Milk Foam</w:t>
+            </w:r>
           </w:p>
         </w:tc>
         <w:tc>
@@ -1238,11 +1149,9 @@
             <w:tcW w:w="0" w:type="auto"/>
           </w:tcPr>
           <w:p>
-            <w:proofErr w:type="spellStart"/>
             <w:r>
               <w:t>Americano</w:t>
             </w:r>
-            <w:proofErr w:type="spellEnd"/>
           </w:p>
         </w:tc>
         <w:tc>
@@ -1315,13 +1224,8 @@
             <w:tcW w:w="0" w:type="auto"/>
           </w:tcPr>
           <w:p>
-            <w:proofErr w:type="spellStart"/>
-            <w:r>
-              <w:t>Caffé</w:t>
-            </w:r>
-            <w:proofErr w:type="spellEnd"/>
-            <w:r>
-              <w:t xml:space="preserve"> Latte</w:t>
+            <w:r>
+              <w:t>Caffé Latte</w:t>
             </w:r>
           </w:p>
         </w:tc>
@@ -1346,19 +1250,9 @@
             <w:pPr>
               <w:cnfStyle w:val="000000100000" w:firstRow="0" w:lastRow="0" w:firstColumn="0" w:lastColumn="0" w:oddVBand="0" w:evenVBand="0" w:oddHBand="1" w:evenHBand="0" w:firstRowFirstColumn="0" w:firstRowLastColumn="0" w:lastRowFirstColumn="0" w:lastRowLastColumn="0"/>
             </w:pPr>
-            <w:proofErr w:type="spellStart"/>
-            <w:r>
-              <w:t>Steamed</w:t>
-            </w:r>
-            <w:proofErr w:type="spellEnd"/>
-            <w:r>
-              <w:t xml:space="preserve"> </w:t>
-            </w:r>
-            <w:proofErr w:type="spellStart"/>
-            <w:r>
-              <w:t>Milk</w:t>
-            </w:r>
-            <w:proofErr w:type="spellEnd"/>
+            <w:r>
+              <w:t>Steamed Milk</w:t>
+            </w:r>
           </w:p>
         </w:tc>
         <w:tc>
@@ -1369,19 +1263,9 @@
             <w:pPr>
               <w:cnfStyle w:val="000000100000" w:firstRow="0" w:lastRow="0" w:firstColumn="0" w:lastColumn="0" w:oddVBand="0" w:evenVBand="0" w:oddHBand="1" w:evenHBand="0" w:firstRowFirstColumn="0" w:firstRowLastColumn="0" w:lastRowFirstColumn="0" w:lastRowLastColumn="0"/>
             </w:pPr>
-            <w:proofErr w:type="spellStart"/>
-            <w:r>
-              <w:t>Steamed</w:t>
-            </w:r>
-            <w:proofErr w:type="spellEnd"/>
-            <w:r>
-              <w:t xml:space="preserve"> </w:t>
-            </w:r>
-            <w:proofErr w:type="spellStart"/>
-            <w:r>
-              <w:t>Milk</w:t>
-            </w:r>
-            <w:proofErr w:type="spellEnd"/>
+            <w:r>
+              <w:t>Steamed Milk</w:t>
+            </w:r>
           </w:p>
         </w:tc>
         <w:tc>
@@ -1392,19 +1276,9 @@
             <w:pPr>
               <w:cnfStyle w:val="000000100000" w:firstRow="0" w:lastRow="0" w:firstColumn="0" w:lastColumn="0" w:oddVBand="0" w:evenVBand="0" w:oddHBand="1" w:evenHBand="0" w:firstRowFirstColumn="0" w:firstRowLastColumn="0" w:lastRowFirstColumn="0" w:lastRowLastColumn="0"/>
             </w:pPr>
-            <w:proofErr w:type="spellStart"/>
-            <w:r>
-              <w:t>Milk</w:t>
-            </w:r>
-            <w:proofErr w:type="spellEnd"/>
-            <w:r>
-              <w:t xml:space="preserve"> </w:t>
-            </w:r>
-            <w:proofErr w:type="spellStart"/>
-            <w:r>
-              <w:t>Foam</w:t>
-            </w:r>
-            <w:proofErr w:type="spellEnd"/>
+            <w:r>
+              <w:t>Milk Foam</w:t>
+            </w:r>
           </w:p>
         </w:tc>
         <w:tc>
@@ -1451,19 +1325,9 @@
             <w:pPr>
               <w:cnfStyle w:val="000000000000" w:firstRow="0" w:lastRow="0" w:firstColumn="0" w:lastColumn="0" w:oddVBand="0" w:evenVBand="0" w:oddHBand="0" w:evenHBand="0" w:firstRowFirstColumn="0" w:firstRowLastColumn="0" w:lastRowFirstColumn="0" w:lastRowLastColumn="0"/>
             </w:pPr>
-            <w:proofErr w:type="spellStart"/>
-            <w:r>
-              <w:t>Steamed</w:t>
-            </w:r>
-            <w:proofErr w:type="spellEnd"/>
-            <w:r>
-              <w:t xml:space="preserve"> </w:t>
-            </w:r>
-            <w:proofErr w:type="spellStart"/>
-            <w:r>
-              <w:t>Milk</w:t>
-            </w:r>
-            <w:proofErr w:type="spellEnd"/>
+            <w:r>
+              <w:t>Steamed Milk</w:t>
+            </w:r>
           </w:p>
         </w:tc>
         <w:tc>
@@ -1474,19 +1338,9 @@
             <w:pPr>
               <w:cnfStyle w:val="000000000000" w:firstRow="0" w:lastRow="0" w:firstColumn="0" w:lastColumn="0" w:oddVBand="0" w:evenVBand="0" w:oddHBand="0" w:evenHBand="0" w:firstRowFirstColumn="0" w:firstRowLastColumn="0" w:lastRowFirstColumn="0" w:lastRowLastColumn="0"/>
             </w:pPr>
-            <w:proofErr w:type="spellStart"/>
-            <w:r>
-              <w:t>Steamed</w:t>
-            </w:r>
-            <w:proofErr w:type="spellEnd"/>
-            <w:r>
-              <w:t xml:space="preserve"> </w:t>
-            </w:r>
-            <w:proofErr w:type="spellStart"/>
-            <w:r>
-              <w:t>Milk</w:t>
-            </w:r>
-            <w:proofErr w:type="spellEnd"/>
+            <w:r>
+              <w:t>Steamed Milk</w:t>
+            </w:r>
           </w:p>
         </w:tc>
         <w:tc>
@@ -1589,11 +1443,9 @@
             <w:tcW w:w="0" w:type="auto"/>
           </w:tcPr>
           <w:p>
-            <w:proofErr w:type="spellStart"/>
             <w:r>
               <w:t>Morocchino</w:t>
             </w:r>
-            <w:proofErr w:type="spellEnd"/>
           </w:p>
         </w:tc>
         <w:tc>
@@ -1630,19 +1482,9 @@
             <w:pPr>
               <w:cnfStyle w:val="000000000000" w:firstRow="0" w:lastRow="0" w:firstColumn="0" w:lastColumn="0" w:oddVBand="0" w:evenVBand="0" w:oddHBand="0" w:evenHBand="0" w:firstRowFirstColumn="0" w:firstRowLastColumn="0" w:lastRowFirstColumn="0" w:lastRowLastColumn="0"/>
             </w:pPr>
-            <w:proofErr w:type="spellStart"/>
-            <w:r>
-              <w:t>Milk</w:t>
-            </w:r>
-            <w:proofErr w:type="spellEnd"/>
-            <w:r>
-              <w:t xml:space="preserve"> </w:t>
-            </w:r>
-            <w:proofErr w:type="spellStart"/>
-            <w:r>
-              <w:t>Foam</w:t>
-            </w:r>
-            <w:proofErr w:type="spellEnd"/>
+            <w:r>
+              <w:t>Milk Foam</w:t>
+            </w:r>
           </w:p>
         </w:tc>
         <w:tc>
@@ -1676,11 +1518,9 @@
             <w:tcW w:w="0" w:type="auto"/>
           </w:tcPr>
           <w:p>
-            <w:proofErr w:type="spellStart"/>
             <w:r>
               <w:t>Mocha</w:t>
             </w:r>
-            <w:proofErr w:type="spellEnd"/>
           </w:p>
         </w:tc>
         <w:tc>
@@ -1717,19 +1557,9 @@
             <w:pPr>
               <w:cnfStyle w:val="000000100000" w:firstRow="0" w:lastRow="0" w:firstColumn="0" w:lastColumn="0" w:oddVBand="0" w:evenVBand="0" w:oddHBand="1" w:evenHBand="0" w:firstRowFirstColumn="0" w:firstRowLastColumn="0" w:lastRowFirstColumn="0" w:lastRowLastColumn="0"/>
             </w:pPr>
-            <w:proofErr w:type="spellStart"/>
-            <w:r>
-              <w:t>Steamed</w:t>
-            </w:r>
-            <w:proofErr w:type="spellEnd"/>
-            <w:r>
-              <w:t xml:space="preserve"> </w:t>
-            </w:r>
-            <w:proofErr w:type="spellStart"/>
-            <w:r>
-              <w:t>Milk</w:t>
-            </w:r>
-            <w:proofErr w:type="spellEnd"/>
+            <w:r>
+              <w:t>Steamed Milk</w:t>
+            </w:r>
           </w:p>
         </w:tc>
         <w:tc>
@@ -1740,11 +1570,9 @@
             <w:pPr>
               <w:cnfStyle w:val="000000100000" w:firstRow="0" w:lastRow="0" w:firstColumn="0" w:lastColumn="0" w:oddVBand="0" w:evenVBand="0" w:oddHBand="1" w:evenHBand="0" w:firstRowFirstColumn="0" w:firstRowLastColumn="0" w:lastRowFirstColumn="0" w:lastRowLastColumn="0"/>
             </w:pPr>
-            <w:proofErr w:type="spellStart"/>
             <w:r>
               <w:t>Whip</w:t>
             </w:r>
-            <w:proofErr w:type="spellEnd"/>
           </w:p>
         </w:tc>
         <w:tc>
@@ -1765,11 +1593,9 @@
             <w:tcW w:w="0" w:type="auto"/>
           </w:tcPr>
           <w:p>
-            <w:proofErr w:type="spellStart"/>
             <w:r>
               <w:t>Bicerin</w:t>
             </w:r>
-            <w:proofErr w:type="spellEnd"/>
           </w:p>
         </w:tc>
         <w:tc>
@@ -1819,11 +1645,9 @@
             <w:pPr>
               <w:cnfStyle w:val="000000000000" w:firstRow="0" w:lastRow="0" w:firstColumn="0" w:lastColumn="0" w:oddVBand="0" w:evenVBand="0" w:oddHBand="0" w:evenHBand="0" w:firstRowFirstColumn="0" w:firstRowLastColumn="0" w:lastRowFirstColumn="0" w:lastRowLastColumn="0"/>
             </w:pPr>
-            <w:proofErr w:type="spellStart"/>
             <w:r>
               <w:t>Whip</w:t>
             </w:r>
-            <w:proofErr w:type="spellEnd"/>
           </w:p>
         </w:tc>
         <w:tc>
@@ -1873,19 +1697,9 @@
             <w:pPr>
               <w:cnfStyle w:val="000000100000" w:firstRow="0" w:lastRow="0" w:firstColumn="0" w:lastColumn="0" w:oddVBand="0" w:evenVBand="0" w:oddHBand="1" w:evenHBand="0" w:firstRowFirstColumn="0" w:firstRowLastColumn="0" w:lastRowFirstColumn="0" w:lastRowLastColumn="0"/>
             </w:pPr>
-            <w:proofErr w:type="spellStart"/>
-            <w:r>
-              <w:t>Milk</w:t>
-            </w:r>
-            <w:proofErr w:type="spellEnd"/>
-            <w:r>
-              <w:t xml:space="preserve"> </w:t>
-            </w:r>
-            <w:proofErr w:type="spellStart"/>
-            <w:r>
-              <w:t>Foam</w:t>
-            </w:r>
-            <w:proofErr w:type="spellEnd"/>
+            <w:r>
+              <w:t>Milk Foam</w:t>
+            </w:r>
           </w:p>
         </w:tc>
         <w:tc>
@@ -1897,13 +1711,8 @@
               <w:cnfStyle w:val="000000100000" w:firstRow="0" w:lastRow="0" w:firstColumn="0" w:lastColumn="0" w:oddVBand="0" w:evenVBand="0" w:oddHBand="1" w:evenHBand="0" w:firstRowFirstColumn="0" w:firstRowLastColumn="0" w:lastRowFirstColumn="0" w:lastRowLastColumn="0"/>
             </w:pPr>
             <w:r>
-              <w:t xml:space="preserve">Half </w:t>
-            </w:r>
-            <w:proofErr w:type="spellStart"/>
-            <w:r>
-              <w:t>Milk</w:t>
-            </w:r>
-            <w:proofErr w:type="spellEnd"/>
+              <w:t>Half Milk</w:t>
+            </w:r>
           </w:p>
         </w:tc>
         <w:tc>
@@ -1934,13 +1743,8 @@
             <w:tcW w:w="0" w:type="auto"/>
           </w:tcPr>
           <w:p>
-            <w:proofErr w:type="spellStart"/>
-            <w:r>
-              <w:t>Raf</w:t>
-            </w:r>
-            <w:proofErr w:type="spellEnd"/>
-            <w:r>
-              <w:t xml:space="preserve"> coffee</w:t>
+            <w:r>
+              <w:t>Raf coffee</w:t>
             </w:r>
           </w:p>
         </w:tc>
@@ -1965,13 +1769,8 @@
             <w:pPr>
               <w:cnfStyle w:val="000000000000" w:firstRow="0" w:lastRow="0" w:firstColumn="0" w:lastColumn="0" w:oddVBand="0" w:evenVBand="0" w:oddHBand="0" w:evenHBand="0" w:firstRowFirstColumn="0" w:firstRowLastColumn="0" w:lastRowFirstColumn="0" w:lastRowLastColumn="0"/>
             </w:pPr>
-            <w:proofErr w:type="spellStart"/>
-            <w:r>
-              <w:t>Vanilla</w:t>
-            </w:r>
-            <w:proofErr w:type="spellEnd"/>
-            <w:r>
-              <w:t xml:space="preserve"> Sugar</w:t>
+            <w:r>
+              <w:t>Vanilla Sugar</w:t>
             </w:r>
           </w:p>
         </w:tc>
@@ -2019,19 +1818,9 @@
             <w:tcW w:w="0" w:type="auto"/>
           </w:tcPr>
           <w:p>
-            <w:proofErr w:type="spellStart"/>
-            <w:r>
-              <w:t>Mead</w:t>
-            </w:r>
-            <w:proofErr w:type="spellEnd"/>
-            <w:r>
-              <w:t xml:space="preserve"> </w:t>
-            </w:r>
-            <w:proofErr w:type="spellStart"/>
-            <w:r>
-              <w:t>raf</w:t>
-            </w:r>
-            <w:proofErr w:type="spellEnd"/>
+            <w:r>
+              <w:t>Mead raf</w:t>
+            </w:r>
           </w:p>
         </w:tc>
         <w:tc>
@@ -2055,11 +1844,9 @@
             <w:pPr>
               <w:cnfStyle w:val="000000100000" w:firstRow="0" w:lastRow="0" w:firstColumn="0" w:lastColumn="0" w:oddVBand="0" w:evenVBand="0" w:oddHBand="1" w:evenHBand="0" w:firstRowFirstColumn="0" w:firstRowLastColumn="0" w:lastRowFirstColumn="0" w:lastRowLastColumn="0"/>
             </w:pPr>
-            <w:proofErr w:type="spellStart"/>
             <w:r>
               <w:t>Honey</w:t>
             </w:r>
-            <w:proofErr w:type="spellEnd"/>
           </w:p>
         </w:tc>
         <w:tc>
@@ -2103,11 +1890,9 @@
             <w:tcW w:w="0" w:type="auto"/>
           </w:tcPr>
           <w:p>
-            <w:proofErr w:type="spellStart"/>
             <w:r>
               <w:t>Galao</w:t>
             </w:r>
-            <w:proofErr w:type="spellEnd"/>
           </w:p>
         </w:tc>
         <w:tc>
@@ -2131,19 +1916,9 @@
             <w:pPr>
               <w:cnfStyle w:val="000000000000" w:firstRow="0" w:lastRow="0" w:firstColumn="0" w:lastColumn="0" w:oddVBand="0" w:evenVBand="0" w:oddHBand="0" w:evenHBand="0" w:firstRowFirstColumn="0" w:firstRowLastColumn="0" w:lastRowFirstColumn="0" w:lastRowLastColumn="0"/>
             </w:pPr>
-            <w:proofErr w:type="spellStart"/>
-            <w:r>
-              <w:t>Milk</w:t>
-            </w:r>
-            <w:proofErr w:type="spellEnd"/>
-            <w:r>
-              <w:t xml:space="preserve"> </w:t>
-            </w:r>
-            <w:proofErr w:type="spellStart"/>
-            <w:r>
-              <w:t>Foam</w:t>
-            </w:r>
-            <w:proofErr w:type="spellEnd"/>
+            <w:r>
+              <w:t>Milk Foam</w:t>
+            </w:r>
           </w:p>
         </w:tc>
         <w:tc>
@@ -2154,19 +1929,9 @@
             <w:pPr>
               <w:cnfStyle w:val="000000000000" w:firstRow="0" w:lastRow="0" w:firstColumn="0" w:lastColumn="0" w:oddVBand="0" w:evenVBand="0" w:oddHBand="0" w:evenHBand="0" w:firstRowFirstColumn="0" w:firstRowLastColumn="0" w:lastRowFirstColumn="0" w:lastRowLastColumn="0"/>
             </w:pPr>
-            <w:proofErr w:type="spellStart"/>
-            <w:r>
-              <w:t>Milk</w:t>
-            </w:r>
-            <w:proofErr w:type="spellEnd"/>
-            <w:r>
-              <w:t xml:space="preserve"> </w:t>
-            </w:r>
-            <w:proofErr w:type="spellStart"/>
-            <w:r>
-              <w:t>Foam</w:t>
-            </w:r>
-            <w:proofErr w:type="spellEnd"/>
+            <w:r>
+              <w:t>Milk Foam</w:t>
+            </w:r>
           </w:p>
         </w:tc>
         <w:tc>
@@ -2200,19 +1965,9 @@
             <w:tcW w:w="0" w:type="auto"/>
           </w:tcPr>
           <w:p>
-            <w:proofErr w:type="spellStart"/>
-            <w:r>
-              <w:t>Caffé</w:t>
-            </w:r>
-            <w:proofErr w:type="spellEnd"/>
-            <w:r>
-              <w:t xml:space="preserve"> </w:t>
-            </w:r>
-            <w:proofErr w:type="spellStart"/>
-            <w:r>
-              <w:t>affogato</w:t>
-            </w:r>
-            <w:proofErr w:type="spellEnd"/>
+            <w:r>
+              <w:t>Caffé affogato</w:t>
+            </w:r>
           </w:p>
         </w:tc>
         <w:tc>
@@ -2321,11 +2076,9 @@
             <w:pPr>
               <w:cnfStyle w:val="000000000000" w:firstRow="0" w:lastRow="0" w:firstColumn="0" w:lastColumn="0" w:oddVBand="0" w:evenVBand="0" w:oddHBand="0" w:evenHBand="0" w:firstRowFirstColumn="0" w:firstRowLastColumn="0" w:lastRowFirstColumn="0" w:lastRowLastColumn="0"/>
             </w:pPr>
-            <w:proofErr w:type="spellStart"/>
             <w:r>
               <w:t>Whip</w:t>
             </w:r>
-            <w:proofErr w:type="spellEnd"/>
           </w:p>
         </w:tc>
         <w:tc>
@@ -2336,11 +2089,9 @@
             <w:pPr>
               <w:cnfStyle w:val="000000000000" w:firstRow="0" w:lastRow="0" w:firstColumn="0" w:lastColumn="0" w:oddVBand="0" w:evenVBand="0" w:oddHBand="0" w:evenHBand="0" w:firstRowFirstColumn="0" w:firstRowLastColumn="0" w:lastRowFirstColumn="0" w:lastRowLastColumn="0"/>
             </w:pPr>
-            <w:proofErr w:type="spellStart"/>
             <w:r>
               <w:t>Whip</w:t>
             </w:r>
-            <w:proofErr w:type="spellEnd"/>
           </w:p>
         </w:tc>
         <w:tc>
@@ -2364,11 +2115,9 @@
             <w:tcW w:w="0" w:type="auto"/>
           </w:tcPr>
           <w:p>
-            <w:proofErr w:type="spellStart"/>
             <w:r>
               <w:t>Glace</w:t>
             </w:r>
-            <w:proofErr w:type="spellEnd"/>
           </w:p>
         </w:tc>
         <w:tc>
@@ -2436,13 +2185,8 @@
           </w:tcPr>
           <w:p>
             <w:r>
-              <w:t xml:space="preserve">Chocolate </w:t>
-            </w:r>
-            <w:proofErr w:type="spellStart"/>
-            <w:r>
-              <w:t>milk</w:t>
-            </w:r>
-            <w:proofErr w:type="spellEnd"/>
+              <w:t>Chocolate milk</w:t>
+            </w:r>
           </w:p>
         </w:tc>
         <w:tc>
@@ -2466,11 +2210,9 @@
             <w:pPr>
               <w:cnfStyle w:val="000000000000" w:firstRow="0" w:lastRow="0" w:firstColumn="0" w:lastColumn="0" w:oddVBand="0" w:evenVBand="0" w:oddHBand="0" w:evenHBand="0" w:firstRowFirstColumn="0" w:firstRowLastColumn="0" w:lastRowFirstColumn="0" w:lastRowLastColumn="0"/>
             </w:pPr>
-            <w:proofErr w:type="spellStart"/>
             <w:r>
               <w:t>Milk</w:t>
             </w:r>
-            <w:proofErr w:type="spellEnd"/>
           </w:p>
         </w:tc>
         <w:tc>
@@ -2481,11 +2223,9 @@
             <w:pPr>
               <w:cnfStyle w:val="000000000000" w:firstRow="0" w:lastRow="0" w:firstColumn="0" w:lastColumn="0" w:oddVBand="0" w:evenVBand="0" w:oddHBand="0" w:evenHBand="0" w:firstRowFirstColumn="0" w:firstRowLastColumn="0" w:lastRowFirstColumn="0" w:lastRowLastColumn="0"/>
             </w:pPr>
-            <w:proofErr w:type="spellStart"/>
             <w:r>
               <w:t>Milk</w:t>
             </w:r>
-            <w:proofErr w:type="spellEnd"/>
           </w:p>
         </w:tc>
         <w:tc>
@@ -2520,13 +2260,8 @@
           </w:tcPr>
           <w:p>
             <w:r>
-              <w:t xml:space="preserve">Demi – </w:t>
-            </w:r>
-            <w:proofErr w:type="spellStart"/>
-            <w:r>
-              <w:t>créme</w:t>
-            </w:r>
-            <w:proofErr w:type="spellEnd"/>
+              <w:t>Demi – créme</w:t>
+            </w:r>
           </w:p>
         </w:tc>
         <w:tc>
@@ -2576,11 +2311,9 @@
             <w:pPr>
               <w:cnfStyle w:val="000000100000" w:firstRow="0" w:lastRow="0" w:firstColumn="0" w:lastColumn="0" w:oddVBand="0" w:evenVBand="0" w:oddHBand="1" w:evenHBand="0" w:firstRowFirstColumn="0" w:firstRowLastColumn="0" w:lastRowFirstColumn="0" w:lastRowLastColumn="0"/>
             </w:pPr>
-            <w:proofErr w:type="gramStart"/>
             <w:r>
               <w:t>cream</w:t>
             </w:r>
-            <w:proofErr w:type="gramEnd"/>
           </w:p>
         </w:tc>
         <w:tc>
@@ -2602,13 +2335,8 @@
           </w:tcPr>
           <w:p>
             <w:r>
-              <w:t xml:space="preserve">Latte </w:t>
-            </w:r>
-            <w:proofErr w:type="spellStart"/>
-            <w:r>
-              <w:t>macchiato</w:t>
-            </w:r>
-            <w:proofErr w:type="spellEnd"/>
+              <w:t>Latte macchiato</w:t>
+            </w:r>
           </w:p>
         </w:tc>
         <w:tc>
@@ -2632,19 +2360,9 @@
             <w:pPr>
               <w:cnfStyle w:val="000000000000" w:firstRow="0" w:lastRow="0" w:firstColumn="0" w:lastColumn="0" w:oddVBand="0" w:evenVBand="0" w:oddHBand="0" w:evenHBand="0" w:firstRowFirstColumn="0" w:firstRowLastColumn="0" w:lastRowFirstColumn="0" w:lastRowLastColumn="0"/>
             </w:pPr>
-            <w:proofErr w:type="spellStart"/>
-            <w:r>
-              <w:t>Steamed</w:t>
-            </w:r>
-            <w:proofErr w:type="spellEnd"/>
-            <w:r>
-              <w:t xml:space="preserve"> </w:t>
-            </w:r>
-            <w:proofErr w:type="spellStart"/>
-            <w:r>
-              <w:t>Milk</w:t>
-            </w:r>
-            <w:proofErr w:type="spellEnd"/>
+            <w:r>
+              <w:t>Steamed Milk</w:t>
+            </w:r>
           </w:p>
         </w:tc>
         <w:tc>
@@ -2655,19 +2373,9 @@
             <w:pPr>
               <w:cnfStyle w:val="000000000000" w:firstRow="0" w:lastRow="0" w:firstColumn="0" w:lastColumn="0" w:oddVBand="0" w:evenVBand="0" w:oddHBand="0" w:evenHBand="0" w:firstRowFirstColumn="0" w:firstRowLastColumn="0" w:lastRowFirstColumn="0" w:lastRowLastColumn="0"/>
             </w:pPr>
-            <w:proofErr w:type="spellStart"/>
-            <w:r>
-              <w:t>Steamed</w:t>
-            </w:r>
-            <w:proofErr w:type="spellEnd"/>
-            <w:r>
-              <w:t xml:space="preserve"> </w:t>
-            </w:r>
-            <w:proofErr w:type="spellStart"/>
-            <w:r>
-              <w:t>Milk</w:t>
-            </w:r>
-            <w:proofErr w:type="spellEnd"/>
+            <w:r>
+              <w:t>Steamed Milk</w:t>
+            </w:r>
           </w:p>
         </w:tc>
         <w:tc>
@@ -2678,19 +2386,9 @@
             <w:pPr>
               <w:cnfStyle w:val="000000000000" w:firstRow="0" w:lastRow="0" w:firstColumn="0" w:lastColumn="0" w:oddVBand="0" w:evenVBand="0" w:oddHBand="0" w:evenHBand="0" w:firstRowFirstColumn="0" w:firstRowLastColumn="0" w:lastRowFirstColumn="0" w:lastRowLastColumn="0"/>
             </w:pPr>
-            <w:proofErr w:type="spellStart"/>
-            <w:r>
-              <w:t>Milk</w:t>
-            </w:r>
-            <w:proofErr w:type="spellEnd"/>
-            <w:r>
-              <w:t xml:space="preserve"> </w:t>
-            </w:r>
-            <w:proofErr w:type="spellStart"/>
-            <w:r>
-              <w:t>Foam</w:t>
-            </w:r>
-            <w:proofErr w:type="spellEnd"/>
+            <w:r>
+              <w:t>Milk Foam</w:t>
+            </w:r>
           </w:p>
         </w:tc>
         <w:tc>
@@ -2714,11 +2412,9 @@
             <w:tcW w:w="0" w:type="auto"/>
           </w:tcPr>
           <w:p>
-            <w:proofErr w:type="spellStart"/>
             <w:r>
               <w:t>Freddo</w:t>
             </w:r>
-            <w:proofErr w:type="spellEnd"/>
           </w:p>
         </w:tc>
         <w:tc>
@@ -2742,11 +2438,9 @@
             <w:pPr>
               <w:cnfStyle w:val="000000100000" w:firstRow="0" w:lastRow="0" w:firstColumn="0" w:lastColumn="0" w:oddVBand="0" w:evenVBand="0" w:oddHBand="1" w:evenHBand="0" w:firstRowFirstColumn="0" w:firstRowLastColumn="0" w:lastRowFirstColumn="0" w:lastRowLastColumn="0"/>
             </w:pPr>
-            <w:proofErr w:type="spellStart"/>
             <w:r>
               <w:t>Liqour</w:t>
             </w:r>
-            <w:proofErr w:type="spellEnd"/>
           </w:p>
         </w:tc>
         <w:tc>
@@ -2829,19 +2523,9 @@
             <w:pPr>
               <w:cnfStyle w:val="000000000000" w:firstRow="0" w:lastRow="0" w:firstColumn="0" w:lastColumn="0" w:oddVBand="0" w:evenVBand="0" w:oddHBand="0" w:evenHBand="0" w:firstRowFirstColumn="0" w:firstRowLastColumn="0" w:lastRowFirstColumn="0" w:lastRowLastColumn="0"/>
             </w:pPr>
-            <w:proofErr w:type="spellStart"/>
-            <w:r>
-              <w:t>Steamed</w:t>
-            </w:r>
-            <w:proofErr w:type="spellEnd"/>
-            <w:r>
-              <w:t xml:space="preserve"> </w:t>
-            </w:r>
-            <w:proofErr w:type="spellStart"/>
-            <w:r>
-              <w:t>Milk</w:t>
-            </w:r>
-            <w:proofErr w:type="spellEnd"/>
+            <w:r>
+              <w:t>Steamed Milk</w:t>
+            </w:r>
           </w:p>
         </w:tc>
         <w:tc>
@@ -2852,11 +2536,9 @@
             <w:pPr>
               <w:cnfStyle w:val="000000000000" w:firstRow="0" w:lastRow="0" w:firstColumn="0" w:lastColumn="0" w:oddVBand="0" w:evenVBand="0" w:oddHBand="0" w:evenHBand="0" w:firstRowFirstColumn="0" w:firstRowLastColumn="0" w:lastRowFirstColumn="0" w:lastRowLastColumn="0"/>
             </w:pPr>
-            <w:proofErr w:type="spellStart"/>
             <w:r>
               <w:t>Whip</w:t>
             </w:r>
-            <w:proofErr w:type="spellEnd"/>
           </w:p>
         </w:tc>
         <w:tc>
@@ -2880,13 +2562,8 @@
             <w:tcW w:w="0" w:type="auto"/>
           </w:tcPr>
           <w:p>
-            <w:proofErr w:type="spellStart"/>
-            <w:r>
-              <w:t>Caramel</w:t>
-            </w:r>
-            <w:proofErr w:type="spellEnd"/>
-            <w:r>
-              <w:t xml:space="preserve"> frappuccino</w:t>
+            <w:r>
+              <w:t>Caramel frappuccino</w:t>
             </w:r>
           </w:p>
         </w:tc>
@@ -2924,19 +2601,9 @@
             <w:pPr>
               <w:cnfStyle w:val="000000100000" w:firstRow="0" w:lastRow="0" w:firstColumn="0" w:lastColumn="0" w:oddVBand="0" w:evenVBand="0" w:oddHBand="1" w:evenHBand="0" w:firstRowFirstColumn="0" w:firstRowLastColumn="0" w:lastRowFirstColumn="0" w:lastRowLastColumn="0"/>
             </w:pPr>
-            <w:proofErr w:type="spellStart"/>
-            <w:r>
-              <w:t>Steamed</w:t>
-            </w:r>
-            <w:proofErr w:type="spellEnd"/>
-            <w:r>
-              <w:t xml:space="preserve"> </w:t>
-            </w:r>
-            <w:proofErr w:type="spellStart"/>
-            <w:r>
-              <w:t>Milk</w:t>
-            </w:r>
-            <w:proofErr w:type="spellEnd"/>
+            <w:r>
+              <w:t>Steamed Milk</w:t>
+            </w:r>
           </w:p>
         </w:tc>
         <w:tc>
@@ -2960,11 +2627,9 @@
             <w:pPr>
               <w:cnfStyle w:val="000000100000" w:firstRow="0" w:lastRow="0" w:firstColumn="0" w:lastColumn="0" w:oddVBand="0" w:evenVBand="0" w:oddHBand="1" w:evenHBand="0" w:firstRowFirstColumn="0" w:firstRowLastColumn="0" w:lastRowFirstColumn="0" w:lastRowLastColumn="0"/>
             </w:pPr>
-            <w:proofErr w:type="spellStart"/>
             <w:r>
               <w:t>Syrup</w:t>
             </w:r>
-            <w:proofErr w:type="spellEnd"/>
           </w:p>
         </w:tc>
       </w:tr>
@@ -3001,19 +2666,9 @@
             <w:pPr>
               <w:cnfStyle w:val="000000000000" w:firstRow="0" w:lastRow="0" w:firstColumn="0" w:lastColumn="0" w:oddVBand="0" w:evenVBand="0" w:oddHBand="0" w:evenHBand="0" w:firstRowFirstColumn="0" w:firstRowLastColumn="0" w:lastRowFirstColumn="0" w:lastRowLastColumn="0"/>
             </w:pPr>
-            <w:proofErr w:type="spellStart"/>
-            <w:r>
-              <w:t>Steamed</w:t>
-            </w:r>
-            <w:proofErr w:type="spellEnd"/>
-            <w:r>
-              <w:t xml:space="preserve"> </w:t>
-            </w:r>
-            <w:proofErr w:type="spellStart"/>
-            <w:r>
-              <w:t>Milk</w:t>
-            </w:r>
-            <w:proofErr w:type="spellEnd"/>
+            <w:r>
+              <w:t>Steamed Milk</w:t>
+            </w:r>
           </w:p>
         </w:tc>
         <w:tc>
@@ -3024,19 +2679,9 @@
             <w:pPr>
               <w:cnfStyle w:val="000000000000" w:firstRow="0" w:lastRow="0" w:firstColumn="0" w:lastColumn="0" w:oddVBand="0" w:evenVBand="0" w:oddHBand="0" w:evenHBand="0" w:firstRowFirstColumn="0" w:firstRowLastColumn="0" w:lastRowFirstColumn="0" w:lastRowLastColumn="0"/>
             </w:pPr>
-            <w:proofErr w:type="spellStart"/>
-            <w:r>
-              <w:t>Steamed</w:t>
-            </w:r>
-            <w:proofErr w:type="spellEnd"/>
-            <w:r>
-              <w:t xml:space="preserve"> </w:t>
-            </w:r>
-            <w:proofErr w:type="spellStart"/>
-            <w:r>
-              <w:t>Milk</w:t>
-            </w:r>
-            <w:proofErr w:type="spellEnd"/>
+            <w:r>
+              <w:t>Steamed Milk</w:t>
+            </w:r>
           </w:p>
         </w:tc>
         <w:tc>
@@ -3112,11 +2757,9 @@
             <w:pPr>
               <w:cnfStyle w:val="000000100000" w:firstRow="0" w:lastRow="0" w:firstColumn="0" w:lastColumn="0" w:oddVBand="0" w:evenVBand="0" w:oddHBand="1" w:evenHBand="0" w:firstRowFirstColumn="0" w:firstRowLastColumn="0" w:lastRowFirstColumn="0" w:lastRowLastColumn="0"/>
             </w:pPr>
-            <w:proofErr w:type="spellStart"/>
             <w:r>
               <w:t>Whiskey</w:t>
             </w:r>
-            <w:proofErr w:type="spellEnd"/>
           </w:p>
         </w:tc>
         <w:tc>
@@ -3127,11 +2770,9 @@
             <w:pPr>
               <w:cnfStyle w:val="000000100000" w:firstRow="0" w:lastRow="0" w:firstColumn="0" w:lastColumn="0" w:oddVBand="0" w:evenVBand="0" w:oddHBand="1" w:evenHBand="0" w:firstRowFirstColumn="0" w:firstRowLastColumn="0" w:lastRowFirstColumn="0" w:lastRowLastColumn="0"/>
             </w:pPr>
-            <w:proofErr w:type="spellStart"/>
             <w:r>
               <w:t>Whip</w:t>
             </w:r>
-            <w:proofErr w:type="spellEnd"/>
           </w:p>
         </w:tc>
         <w:tc>
@@ -9109,6 +8750,19 @@
 </file>
 
 <file path=customXml/item1.xml><?xml version="1.0" encoding="utf-8"?>
+<?mso-contentType ?>
+<FormTemplates xmlns="http://schemas.microsoft.com/sharepoint/v3/contenttype/forms">
+  <Display>DocumentLibraryForm</Display>
+  <Edit>DocumentLibraryForm</Edit>
+  <New>DocumentLibraryForm</New>
+</FormTemplates>
+</file>
+
+<file path=customXml/item2.xml><?xml version="1.0" encoding="utf-8"?>
+<b:Sources xmlns:b="http://schemas.openxmlformats.org/officeDocument/2006/bibliography" xmlns="http://schemas.openxmlformats.org/officeDocument/2006/bibliography" SelectedStyle="/APASixthEditionOfficeOnline.xsl" StyleName="APA" Version="6"/>
+</file>
+
+<file path=customXml/item3.xml><?xml version="1.0" encoding="utf-8"?>
 <ct:contentTypeSchema xmlns:ct="http://schemas.microsoft.com/office/2006/metadata/contentType" xmlns:ma="http://schemas.microsoft.com/office/2006/metadata/properties/metaAttributes" ct:_="" ma:_="" ma:contentTypeName="Document" ma:contentTypeID="0x0101001E178663C6C1154FBF9CBC32AA8D1BC4" ma:contentTypeVersion="22" ma:contentTypeDescription="Een nieuw document maken." ma:contentTypeScope="" ma:versionID="47f77be9a0c5f5b4b34c5faee078f337">
   <xsd:schema xmlns:xsd="http://www.w3.org/2001/XMLSchema" xmlns:xs="http://www.w3.org/2001/XMLSchema" xmlns:p="http://schemas.microsoft.com/office/2006/metadata/properties" xmlns:ns2="bd273f67-5965-45f0-ac4e-d17ce83175e7" xmlns:ns3="e1a4e582-16c8-4a73-92d0-82596f5157ed" targetNamespace="http://schemas.microsoft.com/office/2006/metadata/properties" ma:root="true" ma:fieldsID="36b3ab4c297465ff3789a23bb29b951e" ns2:_="" ns3:_="">
     <xsd:import namespace="bd273f67-5965-45f0-ac4e-d17ce83175e7"/>
@@ -9363,20 +9017,12 @@
 </ct:contentTypeSchema>
 </file>
 
-<file path=customXml/item2.xml><?xml version="1.0" encoding="utf-8"?>
-<b:Sources xmlns:b="http://schemas.openxmlformats.org/officeDocument/2006/bibliography" xmlns="http://schemas.openxmlformats.org/officeDocument/2006/bibliography" SelectedStyle="/APASixthEditionOfficeOnline.xsl" StyleName="APA" Version="6"/>
+<file path=customXml/item4.xml><?xml version="1.0" encoding="utf-8"?>
+<?mso-contentType ?>
+<SharedContentType xmlns="Microsoft.SharePoint.Taxonomy.ContentTypeSync" SourceId="96173d46-5f7d-49bf-a64d-4dd4f1c458b8" ContentTypeId="0x0101" PreviousValue="false"/>
 </file>
 
-<file path=customXml/item3.xml><?xml version="1.0" encoding="utf-8"?>
-<?mso-contentType ?>
-<FormTemplates xmlns="http://schemas.microsoft.com/sharepoint/v3/contenttype/forms">
-  <Display>DocumentLibraryForm</Display>
-  <Edit>DocumentLibraryForm</Edit>
-  <New>DocumentLibraryForm</New>
-</FormTemplates>
-</file>
-
-<file path=customXml/item4.xml><?xml version="1.0" encoding="utf-8"?>
+<file path=customXml/item5.xml><?xml version="1.0" encoding="utf-8"?>
 <p:properties xmlns:p="http://schemas.microsoft.com/office/2006/metadata/properties" xmlns:xsi="http://www.w3.org/2001/XMLSchema-instance" xmlns:pc="http://schemas.microsoft.com/office/infopath/2007/PartnerControls">
   <documentManagement>
     <lcf76f155ced4ddcb4097134ff3c332f xmlns="bd273f67-5965-45f0-ac4e-d17ce83175e7">
@@ -9387,12 +9033,23 @@
 </p:properties>
 </file>
 
-<file path=customXml/item5.xml><?xml version="1.0" encoding="utf-8"?>
-<?mso-contentType ?>
-<SharedContentType xmlns="Microsoft.SharePoint.Taxonomy.ContentTypeSync" SourceId="96173d46-5f7d-49bf-a64d-4dd4f1c458b8" ContentTypeId="0x0101" PreviousValue="false"/>
+<file path=customXml/itemProps1.xml><?xml version="1.0" encoding="utf-8"?>
+<ds:datastoreItem xmlns:ds="http://schemas.openxmlformats.org/officeDocument/2006/customXml" ds:itemID="{A25B3578-7C9B-41F5-A14A-14B3F302CC6A}">
+  <ds:schemaRefs>
+    <ds:schemaRef ds:uri="http://schemas.microsoft.com/sharepoint/v3/contenttype/forms"/>
+  </ds:schemaRefs>
+</ds:datastoreItem>
 </file>
 
-<file path=customXml/itemProps1.xml><?xml version="1.0" encoding="utf-8"?>
+<file path=customXml/itemProps2.xml><?xml version="1.0" encoding="utf-8"?>
+<ds:datastoreItem xmlns:ds="http://schemas.openxmlformats.org/officeDocument/2006/customXml" ds:itemID="{6EC07A6A-086E-6045-A911-CB4E4D508AFB}">
+  <ds:schemaRefs>
+    <ds:schemaRef ds:uri="http://schemas.openxmlformats.org/officeDocument/2006/bibliography"/>
+  </ds:schemaRefs>
+</ds:datastoreItem>
+</file>
+
+<file path=customXml/itemProps3.xml><?xml version="1.0" encoding="utf-8"?>
 <ds:datastoreItem xmlns:ds="http://schemas.openxmlformats.org/officeDocument/2006/customXml" ds:itemID="{264CC6DF-1157-490D-90C4-0822CAC42DFD}">
   <ds:schemaRefs>
     <ds:schemaRef ds:uri="http://schemas.microsoft.com/office/2006/metadata/contentType"/>
@@ -9411,23 +9068,15 @@
 </ds:datastoreItem>
 </file>
 
-<file path=customXml/itemProps2.xml><?xml version="1.0" encoding="utf-8"?>
-<ds:datastoreItem xmlns:ds="http://schemas.openxmlformats.org/officeDocument/2006/customXml" ds:itemID="{6EC07A6A-086E-6045-A911-CB4E4D508AFB}">
+<file path=customXml/itemProps4.xml><?xml version="1.0" encoding="utf-8"?>
+<ds:datastoreItem xmlns:ds="http://schemas.openxmlformats.org/officeDocument/2006/customXml" ds:itemID="{C036E063-0501-4A91-AF28-5142A9D2AD7E}">
   <ds:schemaRefs>
-    <ds:schemaRef ds:uri="http://schemas.openxmlformats.org/officeDocument/2006/bibliography"/>
+    <ds:schemaRef ds:uri="Microsoft.SharePoint.Taxonomy.ContentTypeSync"/>
   </ds:schemaRefs>
 </ds:datastoreItem>
 </file>
 
-<file path=customXml/itemProps3.xml><?xml version="1.0" encoding="utf-8"?>
-<ds:datastoreItem xmlns:ds="http://schemas.openxmlformats.org/officeDocument/2006/customXml" ds:itemID="{A25B3578-7C9B-41F5-A14A-14B3F302CC6A}">
-  <ds:schemaRefs>
-    <ds:schemaRef ds:uri="http://schemas.microsoft.com/sharepoint/v3/contenttype/forms"/>
-  </ds:schemaRefs>
-</ds:datastoreItem>
-</file>
-
-<file path=customXml/itemProps4.xml><?xml version="1.0" encoding="utf-8"?>
+<file path=customXml/itemProps5.xml><?xml version="1.0" encoding="utf-8"?>
 <ds:datastoreItem xmlns:ds="http://schemas.openxmlformats.org/officeDocument/2006/customXml" ds:itemID="{A252A040-BE62-4C1B-9842-E4DC60FDA318}">
   <ds:schemaRefs>
     <ds:schemaRef ds:uri="http://schemas.microsoft.com/office/2006/metadata/properties"/>
@@ -9436,12 +9085,4 @@
     <ds:schemaRef ds:uri="e1a4e582-16c8-4a73-92d0-82596f5157ed"/>
   </ds:schemaRefs>
 </ds:datastoreItem>
-</file>
-
-<file path=customXml/itemProps5.xml><?xml version="1.0" encoding="utf-8"?>
-<ds:datastoreItem xmlns:ds="http://schemas.openxmlformats.org/officeDocument/2006/customXml" ds:itemID="{C036E063-0501-4A91-AF28-5142A9D2AD7E}">
-  <ds:schemaRefs>
-    <ds:schemaRef ds:uri="Microsoft.SharePoint.Taxonomy.ContentTypeSync"/>
-  </ds:schemaRefs>
-</ds:datastoreItem>
 </file>
</xml_diff>